<commit_message>
Finalize proofread Spanish edition (La Promesa del Cardenal)
Reassemble from 13 native español-latino proofread chunks (anglicisms/
calques fixed, agreement/accents/¿¡ corrected, stray dialogue comillas
removed, Reina-Valera Scripture, Mexican-leaning lexicon), re-add ELOGIOS
page, rebuild PDF/EPUB/DOCX with Spanish cover.

Co-Authored-By: Claude Opus 4.8 <noreply@anthropic.com>
Claude-Session: https://claude.ai/code/session_013TTacQAr67Pe2VUwTPop1A
</commit_message>
<xml_diff>
--- a/The_Cardinals_Promise_ES.docx
+++ b/The_Cardinals_Promise_ES.docx
@@ -1510,7 +1510,7 @@
         <w:pStyle w:val="BodyText"/>
       </w:pPr>
       <w:r>
-        <w:t xml:space="preserve">Mi madre se abre su propio camino. Siempre lo ha hecho. Amaba a mi padre. Chris y yo venimos de eso.</w:t>
+        <w:t xml:space="preserve">Mi madre se labra su propio camino. Siempre lo ha hecho. Amaba a mi padre. Chris y yo venimos de eso.</w:t>
       </w:r>
     </w:p>
     <w:p>
@@ -1610,7 +1610,7 @@
         <w:pStyle w:val="BodyText"/>
       </w:pPr>
       <w:r>
-        <w:t xml:space="preserve">Cuando mi madre le hacía frente, la cosa cambiaba. Una noche se puso física, una sola cachetada, y esa única vez le dijo lo que las puertas cerradas con llave y las desapariciones apenas habían insinuado. Su familia lo sabía, y se pusieron de su lado. Ella les había dicho más de una vez que se iba a ir. Le dijeron que si lo hacía, se quedarían con uno de nosotros. La amenaza de llevarse a un hijo era lo que ella no podía soportar. Al final, por eso nos fuimos.</w:t>
+        <w:t xml:space="preserve">Cuando mi madre le hacía frente, la cosa cambiaba. Una noche se puso violenta, una sola cachetada, y esa única vez le dijo lo que las puertas cerradas con llave y las desapariciones apenas habían insinuado. Su familia lo sabía, y se pusieron de su lado. Ella les había dicho más de una vez que se iba a ir. Le dijeron que si lo hacía, se quedarían con uno de nosotros. La amenaza de llevarse a un hijo era lo que ella no podía soportar. Al final, por eso nos fuimos.</w:t>
       </w:r>
     </w:p>
     <w:p>
@@ -2036,7 +2036,7 @@
         <w:pStyle w:val="BodyText"/>
       </w:pPr>
       <w:r>
-        <w:t xml:space="preserve">Años después, volviendo de un crucero por México, con un bronceado tan profundo que a los ojos oficiales de la aduana de Estados Unidos me veía muy mexicano, me apartaron. El papel se veía poco oficial, dijeron. Seguridad me interrogó una hora, luego llegó la policía, luego, dos horas después, el FBI. Siete horas fuera del barco, catorce oficiales distintos, las mismas respuestas cada vez. No estaba nervioso. Por una vez no tenía nada que esconder. Solo estaba avergonzado, de pies a cabeza, y como a la quinta hora me sorprendí preguntándome si esto iba a ser el resto de mi vida, demostrar cuando me lo exigieran que yo era quien el papel decía que era. Mi madre se enteró e hizo lo que ella hace. Fue a un juzgado de New Jersey y volvió a casa con un acta de nacimiento oficial, para que nadie pudiera volver a retener a su hijo siete horas por cómo se veía un documento.</w:t>
+        <w:t xml:space="preserve">Años después, volviendo de un crucero por México, con un bronceado tan profundo que a ojos de los oficiales de la aduana de Estados Unidos me veía muy mexicano, me apartaron. El papel se veía poco oficial, dijeron. Seguridad me interrogó una hora, luego llegó la policía, luego, dos horas después, el FBI. Siete horas fuera del barco, catorce oficiales distintos, las mismas respuestas cada vez. No estaba nervioso. Por una vez no tenía nada que esconder. Solo estaba avergonzado, de pies a cabeza, y como a la quinta hora me sorprendí preguntándome si esto iba a ser el resto de mi vida, demostrar cuando me lo exigieran que yo era quien el papel decía que era. Mi madre se enteró e hizo lo que ella hace. Fue a un juzgado de New Jersey y volvió a casa con un acta de nacimiento oficial, para que nadie pudiera volver a retener a su hijo siete horas por cómo se veía un documento.</w:t>
       </w:r>
     </w:p>
     <w:p>
@@ -2068,7 +2068,7 @@
         <w:pStyle w:val="BodyText"/>
       </w:pPr>
       <w:r>
-        <w:t xml:space="preserve">Mi abuelo era maestro de historia de preparatoria. En casa era un hombre sencillo, y lo quería por eso. Era devoto de Wendy’s, sobre todo de los Frosties, y me dijo una vez, muy en serio, que el único hueco en su vida era que Wendy’s no vendiera hot dogs. Él y mi nana tomaban vino de oporto cada noche en vasos de papel, de un garrafón que guardaban. Juraba por el jabón Ivory para cada parte de un hombre, sin necesidad de shampoo, y lo decía como si fuera información clasificada. Le ponía cátsup a todo — cátsup sobre la cátsup — una costumbre que adopté por completo. Una vez me llevó a las vías del tren y me enseñó a poner una moneda de veinticinco centavos sobre el riel, echar a correr, y volver después del tren para encontrarla aplastada y lisa. A mi madre no le pareció cuando se enteró, y él nunca le vio el problema. Jugábamos UNO y guerra y damas, y Chris se puso a jugar ajedrez con él, pero el ajedrez nunca fue lo mío, y con el UNO me bastaba.</w:t>
+        <w:t xml:space="preserve">Mi abuelo era maestro de historia de preparatoria. En casa era un hombre sencillo, y lo quería por eso. Era devoto de Wendy’s, sobre todo de los Frosties, y me dijo una vez, muy en serio, que el único hueco en su vida era que Wendy’s no vendiera hot dogs. Él y mi nana tomaban vino de oporto cada noche en vasos de papel, de un garrafón que guardaban. Juraba por el jabón Ivory para cada parte de un hombre, sin necesidad de champú, y lo decía como si fuera información clasificada. Le ponía cátsup a todo — cátsup sobre la cátsup — una costumbre que adopté por completo. Una vez me llevó a las vías del tren y me enseñó a poner una moneda de veinticinco centavos sobre el riel, echar a correr, y volver después del tren para encontrarla aplastada y lisa. A mi madre no le pareció cuando se enteró, y él nunca le vio el problema. Jugábamos UNO y guerra y damas, y Chris se puso a jugar ajedrez con él, pero el ajedrez nunca fue lo mío, y con el UNO me bastaba.</w:t>
       </w:r>
     </w:p>
     <w:p>
@@ -2222,7 +2222,7 @@
         <w:pStyle w:val="BodyText"/>
       </w:pPr>
       <w:r>
-        <w:t xml:space="preserve">Todavía no entendía que había habido un padre antes que él, un hombre presente una temporada y ausente la siguiente. El resto de la historia de Horacio la sabría mucho después — que llegó a un punto de quiebre y regresó a México, porque no podía cargar con su propia vida y la nuestra al mismo tiempo. He llegado a creer que se fue para que pudiéramos tener algo que él no podía darnos. Esa es la versión generosa. Es la que me quedo.</w:t>
+        <w:t xml:space="preserve">Todavía no entendía que había habido un padre antes que él, un hombre presente una temporada y ausente la siguiente. El resto de la historia de Horacio la sabría mucho después — que llegó a un punto de quiebre y regresó a México, porque no podía cargar con su propia vida y la nuestra al mismo tiempo. He llegado a creer que se fue para que pudiéramos tener algo que él no podía darnos. Esa es la versión generosa. Es con la que me quedo.</w:t>
       </w:r>
     </w:p>
     <w:p>
@@ -2246,7 +2246,7 @@
         <w:pStyle w:val="BodyText"/>
       </w:pPr>
       <w:r>
-        <w:t xml:space="preserve">De dónde venía explica parte de eso. Su padre vendía frutas y verduras, y de vez en cuando entraban tres hombres de traje y cualquier asunto que tuvieran se resolvía en la trastienda. Cuando venían los parientes de Italia, Lou era el niño que les cedía su cama y dormía en el ático. Cargó con eso más tiempo del que nadie supo. Años después, durante una temporada en que iba a terapia, le salió en una Navidad familiar, un viejo gritándole a su tío por un niño que tenía que dormir en el ático. El temperamento era de ese tipo italiano que ves en las películas. Era más viejo que cualquiera de nosotros, y en realidad nunca fue sobre nosotros.</w:t>
+        <w:t xml:space="preserve">De dónde venía explica parte de eso. Su padre vendía frutas y verduras, y de vez en cuando entraban tres hombres de traje y cualquier asunto que tuvieran se resolvía en la trastienda. Cuando venían los parientes de Italia, Lou era el niño que les cedía su cama y dormía en el ático. Cargó con eso más tiempo del que nadie supo. Años después, durante una temporada en que iba a terapia, le salió en una Navidad familiar, un viejo gritándole a su tío por un niño que tenía que dormir en el ático. El temperamento era de ese tipo italiano que ves en las películas. Era más viejo que cualquiera de nosotros, y en realidad nunca se trató de nosotros.</w:t>
       </w:r>
     </w:p>
     <w:p>
@@ -2262,15 +2262,15 @@
         <w:pStyle w:val="BodyText"/>
       </w:pPr>
       <w:r>
-        <w:t xml:space="preserve">Y estaba Mag. Nos cuidaba a Chris y a mí cuando éramos niños, y todo su programa era consentir. Friendly’s cuando nos cuidaba, tele juntos en el sillón, y algunas noches hamburguesas fritas en mantequilla en un sartén, y estaban deliciosas. Cada vez yo insistía por White Castle y ella lo descartaba — no le gustaba manejar en la carretera, y punto. Era fan de hueso colorado de los Yankees, y estoy convencido de que de ahí lo sacó mi papá. Escuchaba los partidos, y cuando le daba sueño se llevaba el radio a la cama y escuchaba hasta quedarse dormida.</w:t>
-      </w:r>
-    </w:p>
-    <w:p>
-      <w:pPr>
-        <w:pStyle w:val="BodyText"/>
-      </w:pPr>
-      <w:r>
-        <w:t xml:space="preserve">Trabajó en IT la mayor parte de su vida, mucho de eso en la mesa de ayuda, el tipo al que llamas cuando la cosa no sirve, y no paró hasta los ochenta y dos. Siempre andaba buscando la manera de un segundo ingreso, también. Por un tiempo fue dueño de un mercado de pulgas de fin de semana llamado Boardwalk Lew’s — el nombre venía con el lugar y nunca se molestó en cambiarlo — y odié cada sábado que pasé trabajando ahí. Nadie me lo pidió. Cuando lo dejaban solo un domingo veía sus partidos, los Yankees en el verano, los Giants en el otoño. Ese era todo el vicio.</w:t>
+        <w:t xml:space="preserve">Y estaba Mag. Nos cuidaba a Chris y a mí cuando éramos niños, y todo su programa era consentir. Friendly’s cuando nos cuidaba, tele juntos en el sillón, y algunas noches hamburguesas fritas en mantequilla en un sartén, y estaban deliciosas. Cada vez yo insistía en White Castle y ella lo descartaba — no le gustaba manejar en la carretera, y punto. Era fan de hueso colorado de los Yankees, y estoy convencido de que de ahí lo sacó mi papá. Escuchaba los partidos, y cuando le daba sueño se llevaba el radio a la cama y escuchaba hasta quedarse dormida.</w:t>
+      </w:r>
+    </w:p>
+    <w:p>
+      <w:pPr>
+        <w:pStyle w:val="BodyText"/>
+      </w:pPr>
+      <w:r>
+        <w:t xml:space="preserve">Trabajó en IT la mayor parte de su vida, mucho de eso en la mesa de ayuda, el tipo al que llamas cuando la cosa no sirve, y no paró hasta los ochenta y dos. Siempre andaba buscando la manera de tener un segundo ingreso, también. Por un tiempo fue dueño de un mercado de pulgas de fin de semana llamado Boardwalk Lew’s — el nombre venía con el lugar y nunca se molestó en cambiarlo — y odié cada sábado que pasé trabajando ahí. Nadie me lo pidió. Cuando lo dejaban solo un domingo veía sus partidos, los Yankees en el verano, los Giants en el otoño. Ese era todo el vicio.</w:t>
       </w:r>
     </w:p>
     <w:p>
@@ -2310,28 +2310,7 @@
         <w:pStyle w:val="BodyText"/>
       </w:pPr>
       <w:r>
-        <w:t xml:space="preserve">“</w:t>
-      </w:r>
-      <w:r>
-        <w:t xml:space="preserve">Te cambias el nombre a Robert</w:t>
-      </w:r>
-      <w:r>
-        <w:t xml:space="preserve">”</w:t>
-      </w:r>
-      <w:r>
-        <w:t xml:space="preserve">, dijo.</w:t>
-      </w:r>
-      <w:r>
-        <w:t xml:space="preserve"> </w:t>
-      </w:r>
-      <w:r>
-        <w:t xml:space="preserve">“</w:t>
-      </w:r>
-      <w:r>
-        <w:t xml:space="preserve">Rob. Y te doy cien dólares.</w:t>
-      </w:r>
-      <w:r>
-        <w:t xml:space="preserve">”</w:t>
+        <w:t xml:space="preserve">Te cambias el nombre a Robert, dijo. Rob. Y te doy cien dólares.</w:t>
       </w:r>
     </w:p>
     <w:p>
@@ -2347,16 +2326,7 @@
         <w:pStyle w:val="BodyText"/>
       </w:pPr>
       <w:r>
-        <w:t xml:space="preserve">“</w:t>
-      </w:r>
-      <w:r>
-        <w:t xml:space="preserve">Está bien</w:t>
-      </w:r>
-      <w:r>
-        <w:t xml:space="preserve">”</w:t>
-      </w:r>
-      <w:r>
-        <w:t xml:space="preserve">, dije.</w:t>
+        <w:t xml:space="preserve">Está bien, dije.</w:t>
       </w:r>
     </w:p>
     <w:p>
@@ -2542,15 +2512,15 @@
         <w:pStyle w:val="BodyText"/>
       </w:pPr>
       <w:r>
-        <w:t xml:space="preserve">Jon y yo nos encontramos a través de la lucha. Sus hijastros luchaban, yo había luchado, y ese fue el puente. Hay una clave compartida entre la gente de la lucha. No tienes que explicar los cortes de peso, ni las derrotas, ni lo que cuesta volver a salir para el siguiente periodo. Jon lo entendía sin que yo tuviera que decirlo. También es uno de los que más callado sobresale que conozco. Empezó en Juniata College sacando seises y terminó como socio de una importante empresa de software. Más reservado que el resto de nosotros, pero bueno de principio a fin. Su historia rima con la de Chris, el desvalido que se vuelve el éxito. La gente de Lou no se queda tirada.</w:t>
-      </w:r>
-    </w:p>
-    <w:p>
-      <w:pPr>
-        <w:pStyle w:val="BodyText"/>
-      </w:pPr>
-      <w:r>
-        <w:t xml:space="preserve">El momento en que me sentí más cercano a él llegó años después, los dos ya adultos. Para entonces era exitoso, acercándose a la jubilación. Yo estaba en New Jersey para una capacitación de trabajo, y me aventé un viaje de Uber de hora y media solo para ir a verlo. Terminamos caminando, los dos, y me contó sobre un tipo al que había aconsejado en su empresa, lo agradecido que estaba el hombre por la oportunidad, y lo que había hecho por toda su familia. Por como lo contó Jon, de lo que estaba orgulloso no era del éxito. Era de haberle sido útil a alguien. Ese era un lado de él que solo había visto en pedazos. Ese día lo vi completo.</w:t>
+        <w:t xml:space="preserve">Jon y yo nos encontramos a través de la lucha. Sus hijastros luchaban, yo había luchado, y ese fue el puente. Hay una clave compartida entre la gente de la lucha. No tienes que explicar los cortes de peso, ni las derrotas, ni lo que cuesta volver a salir para el siguiente periodo. Jon lo entendía sin que yo tuviera que decirlo. También es uno de los que sobresalen más calladamente que conozco. Empezó en Juniata College sacando seises y terminó como socio de una importante empresa de software. Más reservado que el resto de nosotros, pero bueno de principio a fin. Su historia rima con la de Chris, el desvalido que se vuelve el éxito. La gente de Lou no se queda tirada.</w:t>
+      </w:r>
+    </w:p>
+    <w:p>
+      <w:pPr>
+        <w:pStyle w:val="BodyText"/>
+      </w:pPr>
+      <w:r>
+        <w:t xml:space="preserve">El momento en que me sentí más cercano a él llegó años después, los dos ya adultos. Para entonces era exitoso, acercándose a la jubilación. Yo estaba en New Jersey para una capacitación de trabajo, y me aventé un viaje de Uber de hora y media solo para ir a verlo. Terminamos caminando, los dos, y me contó sobre un tipo al que había aconsejado en su empresa, lo agradecido que estaba el hombre por la oportunidad, y lo que había hecho por toda su familia. Por cómo lo contó Jon, de lo que estaba orgulloso no era del éxito. Era de haberle sido útil a alguien. Ese era un lado de él que solo había visto en pedazos. Ese día lo vi completo.</w:t>
       </w:r>
     </w:p>
     <w:p>
@@ -2603,14 +2573,8 @@
         <w:pStyle w:val="BodyText"/>
       </w:pPr>
       <w:r>
-        <w:t xml:space="preserve">“</w:t>
-      </w:r>
-      <w:r>
         <w:t xml:space="preserve">¿Te puedo decir papá?</w:t>
       </w:r>
-      <w:r>
-        <w:t xml:space="preserve">”</w:t>
-      </w:r>
     </w:p>
     <w:p>
       <w:pPr>
@@ -2625,28 +2589,7 @@
         <w:pStyle w:val="BodyText"/>
       </w:pPr>
       <w:r>
-        <w:t xml:space="preserve">“</w:t>
-      </w:r>
-      <w:r>
-        <w:t xml:space="preserve">Sí</w:t>
-      </w:r>
-      <w:r>
-        <w:t xml:space="preserve">”</w:t>
-      </w:r>
-      <w:r>
-        <w:t xml:space="preserve">, dijo.</w:t>
-      </w:r>
-      <w:r>
-        <w:t xml:space="preserve"> </w:t>
-      </w:r>
-      <w:r>
-        <w:t xml:space="preserve">“</w:t>
-      </w:r>
-      <w:r>
-        <w:t xml:space="preserve">Claro que sí, hijo.</w:t>
-      </w:r>
-      <w:r>
-        <w:t xml:space="preserve">”</w:t>
+        <w:t xml:space="preserve">Sí, dijo. Claro que sí, hijo.</w:t>
       </w:r>
     </w:p>
     <w:p>
@@ -2694,28 +2637,7 @@
         <w:pStyle w:val="BodyText"/>
       </w:pPr>
       <w:r>
-        <w:t xml:space="preserve">“</w:t>
-      </w:r>
-      <w:r>
-        <w:t xml:space="preserve">Mi amor</w:t>
-      </w:r>
-      <w:r>
-        <w:t xml:space="preserve">”</w:t>
-      </w:r>
-      <w:r>
-        <w:t xml:space="preserve">, decía, volviendo a poner la hoja en mi escritorio, dando golpecitos en la esquina de arriba con un dedo.</w:t>
-      </w:r>
-      <w:r>
-        <w:t xml:space="preserve"> </w:t>
-      </w:r>
-      <w:r>
-        <w:t xml:space="preserve">“</w:t>
-      </w:r>
-      <w:r>
-        <w:t xml:space="preserve">¿Te acuerdas? Ahora escribimos Robert.</w:t>
-      </w:r>
-      <w:r>
-        <w:t xml:space="preserve">”</w:t>
+        <w:t xml:space="preserve">Mi amor, decía, volviendo a poner la hoja en mi escritorio, dando golpecitos en la esquina de arriba con un dedo. ¿Te acuerdas? Ahora escribimos Robert.</w:t>
       </w:r>
     </w:p>
     <w:p>
@@ -2830,145 +2752,127 @@
         <w:pStyle w:val="BodyText"/>
       </w:pPr>
       <w:r>
-        <w:t xml:space="preserve">“</w:t>
-      </w:r>
+        <w:t xml:space="preserve">Te quiero tanto como quiero a mis propios hijos. Me lo dijo un día en que yo estaba deshecho frente a él, y me sostuvo la mirada hasta que lo creí. Llevé su apellido antes de entender lo que había detrás. Lo que Lou me enseñó sobre ser hombre se reduce a unas cuantas cosas, y ninguna fue un discurso.</w:t>
+      </w:r>
+    </w:p>
+    <w:p>
+      <w:pPr>
+        <w:pStyle w:val="BodyText"/>
+      </w:pPr>
+      <w:r>
+        <w:t xml:space="preserve">No te quejas. No te haces la víctima. Das la cara.</w:t>
+      </w:r>
+    </w:p>
+    <w:p>
+      <w:pPr>
+        <w:pStyle w:val="BodyText"/>
+      </w:pPr>
+      <w:r>
+        <w:t xml:space="preserve">Nunca me sentó a decirme esas palabras. Simplemente las vivió frente a mí hasta que se volvieron mías.</w:t>
+      </w:r>
+    </w:p>
+    <w:p>
+      <w:pPr>
+        <w:pStyle w:val="BodyText"/>
+      </w:pPr>
+      <w:r>
+        <w:t xml:space="preserve">Cuando me llegó el turno, fueron los torneos de lucha en el norte del estado. Papá me llevaba hasta Nueva York fin de semana tras fin de semana, tan lejos como nos llevara el cuadro del torneo. No hablaba de los kilómetros ni de lo temprano que salíamos ni de que había trabajado la noche anterior. Simplemente se subía al carro, porque su hijo luchaba y ahí era donde debía estar. Si le importaba a uno de sus hijos, la distancia no era una razón. Dabas la cara.</w:t>
+      </w:r>
+    </w:p>
+    <w:p>
+      <w:pPr>
+        <w:pStyle w:val="BodyText"/>
+      </w:pPr>
+      <w:r>
+        <w:t xml:space="preserve">Los viajes eran interminables. Cooperstown. La ciudad de Nueva York. Albany, para ver a los Yankees de Doble-A. Lehigh, allá en Pensilvania. Filadelfia, donde nos llevó a Jon y a mí a un partido de los Giants contra los Eagles. Alguien en las filas de abajo tenía un cartel: LT PREFIERE COKE ANTES QUE PEPSI. Para entonces los problemas de Lawrence Taylor eran burla pública. Lou bajó y le quitó el cartel, y por poco se arma un pleito. Yo era un niño; pensé que se trataba del futbol. Me tomó años preguntarme si se trataba de otra cosa, si alguna parte de él simplemente no soportaba ver a un estadio reírse de un hombre por lo mismo que se lo estaba comiendo.</w:t>
+      </w:r>
+    </w:p>
+    <w:p>
+      <w:pPr>
+        <w:pStyle w:val="BodyText"/>
+      </w:pPr>
+      <w:r>
+        <w:t xml:space="preserve">Entrenaba beisbol, a los Foxes y a los Falcons, y a mí me entrenó más duro que a nadie. Íbamos al campo y me bateaba cien pelotas, y luego otras cien. En las jaulas de bateo alimentaba la máquina hasta que se me pelaban las manos y apenas podía sostener el bat. Nunca me dejó rendirme porque doliera.</w:t>
+      </w:r>
+      <w:r>
+        <w:t xml:space="preserve"> </w:t>
+      </w:r>
+      <w:r>
+        <w:rPr>
+          <w:iCs/>
+          <w:i/>
+        </w:rPr>
+        <w:t xml:space="preserve">Quédate en la caja. Recibe el siguiente lanzamiento.</w:t>
+      </w:r>
+      <w:r>
+        <w:t xml:space="preserve"> </w:t>
+      </w:r>
+      <w:r>
+        <w:t xml:space="preserve">Esa era la lección debajo de la lección.</w:t>
+      </w:r>
+    </w:p>
+    <w:p>
+      <w:pPr>
+        <w:pStyle w:val="BodyText"/>
+      </w:pPr>
+      <w:r>
+        <w:t xml:space="preserve">Chris y papá tenían una frase entre ellos. Después de los grandes momentos, una escuela, una lucha ganada a pulso, un trabajo, se la decían en voz baja el uno al otro.</w:t>
+      </w:r>
+      <w:r>
+        <w:t xml:space="preserve"> </w:t>
+      </w:r>
+      <w:r>
+        <w:rPr>
+          <w:iCs/>
+          <w:i/>
+        </w:rPr>
+        <w:t xml:space="preserve">Oye, papá, lo logramos.</w:t>
+      </w:r>
+      <w:r>
+        <w:t xml:space="preserve"> </w:t>
+      </w:r>
+      <w:r>
+        <w:t xml:space="preserve">Yo tenía mi propia versión en ese carro de regreso del norte del estado, la calma después de un día largo, los dos, la sensación de que lo habíamos hecho juntos. Esa era la idea del amor que tenía Lou. No anunciada. Ganada, juntos. Y cuando estaba orgulloso de ti, no lo decía. Te daba una pequeña sonrisa y una mirada, y la mirada lo decía todo.</w:t>
+      </w:r>
+    </w:p>
+    <w:p>
+      <w:pPr>
+        <w:pStyle w:val="BodyText"/>
+      </w:pPr>
+      <w:r>
+        <w:t xml:space="preserve">Y no eran solo las cosas grandes. Una vez pedí White Castle, y el más cercano estaba a una hora. Me llevó. Una hora de ida por una bolsa de hamburguesitas, porque a su hijo se le antojaban. Cuando necesité una endodoncia en la universidad en Ohio, manejó diez horas para llevarme al dentista y diez horas de regreso. Un día entero manejando, por una silla de dentista. Grande o chico, divertido o doloroso, si era mío, ahí estaba él.</w:t>
+      </w:r>
+    </w:p>
+    <w:p>
+      <w:pPr>
+        <w:pStyle w:val="BodyText"/>
+      </w:pPr>
+      <w:r>
+        <w:t xml:space="preserve">Y una vez fue mucho más grande que un torneo, una bolsa de hamburguesas o una silla de dentista. Estaba en la universidad en Oxford, Ohio, y me encontraba en un lugar oscuro, de esos de los que no hallas la salida, donde al final te cuesta todo lo que tienes solo para admitir que necesitas ayuda. Papá se subió al carro y manejó hasta Ohio. Vino como siempre lo había hecho, salvo que esta vez no era por un partido.</w:t>
+      </w:r>
+    </w:p>
+    <w:p>
+      <w:pPr>
+        <w:pStyle w:val="BodyText"/>
+      </w:pPr>
+      <w:r>
+        <w:t xml:space="preserve">Luego estuvo West Palm Beach. Para entonces ya no era un niño. Era un hombre adulto hundido en la adicción, sin opciones. Papá voló hasta allá y sacó a su hijo moribundo de aquello. No me avergonzó. Dio la cara una vez más, cuando dar la cara significaba salvarme la vida.</w:t>
+      </w:r>
+    </w:p>
+    <w:p>
+      <w:pPr>
+        <w:pStyle w:val="BodyText"/>
+      </w:pPr>
+      <w:r>
+        <w:t xml:space="preserve">Una vez me quebré frente a él. Ya no recuerdo qué me había orillado a eso, solo que estaba deshecho, como solo te permites estarlo frente a alguien seguro. No me dijo que me controlara. Dejó que lo sacara, y luego me miró y lo dijo sin rodeos.</w:t>
+      </w:r>
+    </w:p>
+    <w:p>
+      <w:pPr>
+        <w:pStyle w:val="BodyText"/>
+      </w:pPr>
       <w:r>
         <w:t xml:space="preserve">Te quiero tanto como quiero a mis propios hijos.</w:t>
-      </w:r>
-      <w:r>
-        <w:t xml:space="preserve">”</w:t>
-      </w:r>
-      <w:r>
-        <w:t xml:space="preserve"> </w:t>
-      </w:r>
-      <w:r>
-        <w:t xml:space="preserve">Me lo dijo un día en que yo estaba deshecho frente a él, y me sostuvo la mirada hasta que lo creí. Llevé su apellido antes de entender lo que había detrás. Lo que Lou me enseñó sobre ser hombre se reduce a unas cuantas cosas, y ninguna fue un discurso.</w:t>
-      </w:r>
-    </w:p>
-    <w:p>
-      <w:pPr>
-        <w:pStyle w:val="BodyText"/>
-      </w:pPr>
-      <w:r>
-        <w:t xml:space="preserve">No te quejas. No te haces la víctima. Das la cara.</w:t>
-      </w:r>
-    </w:p>
-    <w:p>
-      <w:pPr>
-        <w:pStyle w:val="BodyText"/>
-      </w:pPr>
-      <w:r>
-        <w:t xml:space="preserve">Nunca me sentó a decirme esas palabras. Simplemente las vivió frente a mí hasta que se volvieron mías.</w:t>
-      </w:r>
-    </w:p>
-    <w:p>
-      <w:pPr>
-        <w:pStyle w:val="BodyText"/>
-      </w:pPr>
-      <w:r>
-        <w:t xml:space="preserve">Cuando me llegó el turno, fueron los torneos de lucha en el norte del estado. Papá me llevaba hasta Nueva York fin de semana tras fin de semana, tan lejos como nos llevara el cuadro del torneo. No hablaba de los kilómetros ni de lo temprano que salíamos ni de que había trabajado la noche anterior. Simplemente se subía al carro, porque su hijo luchaba y ahí era donde debía estar. Si le importaba a uno de sus hijos, la distancia no era una razón. Dabas la cara.</w:t>
-      </w:r>
-    </w:p>
-    <w:p>
-      <w:pPr>
-        <w:pStyle w:val="BodyText"/>
-      </w:pPr>
-      <w:r>
-        <w:t xml:space="preserve">Los viajes eran interminables. Cooperstown. La ciudad de Nueva York. Albany, para ver a los Yankees de Doble-A. Lehigh, allá en Pensilvania. Filadelfia, donde nos llevó a Jon y a mí a un partido de los Giants contra los Eagles. Alguien en las filas de abajo tenía un cartel: LT PREFIERE COKE ANTES QUE PEPSI. Para entonces los problemas de Lawrence Taylor eran burla pública. Lou bajó y le quitó el cartel, y por poco se arma un pleito. Yo era un niño; pensé que se trataba del futbol. Me tomó años preguntarme si se trataba de otra cosa, si alguna parte de él simplemente no soportaba ver a un estadio reírse de un hombre por lo mismo que se lo estaba comiendo.</w:t>
-      </w:r>
-    </w:p>
-    <w:p>
-      <w:pPr>
-        <w:pStyle w:val="BodyText"/>
-      </w:pPr>
-      <w:r>
-        <w:t xml:space="preserve">Entrenaba beisbol, a los Foxes y a los Falcons, y a mí me entrenó más duro que a nadie. Íbamos al campo y me bateaba cien pelotas, y luego otras cien. En las jaulas de bateo alimentaba la máquina hasta que se me pelaban las manos y apenas podía sostener el bat. Nunca me dejó rendirme porque doliera.</w:t>
-      </w:r>
-      <w:r>
-        <w:t xml:space="preserve"> </w:t>
-      </w:r>
-      <w:r>
-        <w:rPr>
-          <w:iCs/>
-          <w:i/>
-        </w:rPr>
-        <w:t xml:space="preserve">Quédate en la caja. Recibe el siguiente lanzamiento.</w:t>
-      </w:r>
-      <w:r>
-        <w:t xml:space="preserve"> </w:t>
-      </w:r>
-      <w:r>
-        <w:t xml:space="preserve">Esa era la lección debajo de la lección.</w:t>
-      </w:r>
-    </w:p>
-    <w:p>
-      <w:pPr>
-        <w:pStyle w:val="BodyText"/>
-      </w:pPr>
-      <w:r>
-        <w:t xml:space="preserve">Chris y papá tenían una frase entre ellos. Después de los grandes momentos, una escuela, una lucha ganada a pulso, un trabajo, se la decían en voz baja el uno al otro.</w:t>
-      </w:r>
-      <w:r>
-        <w:t xml:space="preserve"> </w:t>
-      </w:r>
-      <w:r>
-        <w:rPr>
-          <w:iCs/>
-          <w:i/>
-        </w:rPr>
-        <w:t xml:space="preserve">Oye, papá, lo logramos.</w:t>
-      </w:r>
-      <w:r>
-        <w:t xml:space="preserve"> </w:t>
-      </w:r>
-      <w:r>
-        <w:t xml:space="preserve">Yo tenía mi propia versión en ese carro de regreso del norte del estado, la calma después de un día largo, los dos, la sensación de que habíamos hecho la cosa juntos. Esa era la idea del amor que tenía Lou. No anunciada. Ganada, juntos. Y cuando estaba orgulloso de ti, no lo decía. Te daba una pequeña sonrisa y una mirada, y la mirada lo decía todo.</w:t>
-      </w:r>
-    </w:p>
-    <w:p>
-      <w:pPr>
-        <w:pStyle w:val="BodyText"/>
-      </w:pPr>
-      <w:r>
-        <w:t xml:space="preserve">Y no eran solo las cosas grandes. Una vez pedí White Castle, y el más cercano estaba a una hora. Me llevó. Una hora de ida por una bolsa de hamburguesitas, porque a su hijo se le antojaban. Cuando necesité una endodoncia en la universidad en Ohio, manejó diez horas para llevarme al dentista y diez horas de regreso. Un día entero manejando, por una silla de dentista. Grande o chico, divertido o doloroso, si era mío, ahí estaba él.</w:t>
-      </w:r>
-    </w:p>
-    <w:p>
-      <w:pPr>
-        <w:pStyle w:val="BodyText"/>
-      </w:pPr>
-      <w:r>
-        <w:t xml:space="preserve">Y una vez fue mucho más grande que un torneo, una bolsa de hamburguesas o una silla de dentista. Estaba en la universidad en Oxford, Ohio, y me encontraba en un lugar oscuro, de esos de los que no hallas la salida, donde al final te cuesta todo lo que tienes solo para admitir que necesitas ayuda. Papá se subió al carro y manejó hasta Ohio. Vino como siempre lo había hecho, salvo que esta vez no era por un partido.</w:t>
-      </w:r>
-    </w:p>
-    <w:p>
-      <w:pPr>
-        <w:pStyle w:val="BodyText"/>
-      </w:pPr>
-      <w:r>
-        <w:t xml:space="preserve">Luego estuvo West Palm Beach. Para entonces ya no era un niño. Era un hombre adulto hundido en la adicción, sin opciones. Papá voló hasta allá y sacó a su hijo moribundo de aquello. No me avergonzó. Dio la cara una vez más, cuando dar la cara significaba salvarme la vida.</w:t>
-      </w:r>
-    </w:p>
-    <w:p>
-      <w:pPr>
-        <w:pStyle w:val="BodyText"/>
-      </w:pPr>
-      <w:r>
-        <w:t xml:space="preserve">Una vez me quebré frente a él. Ya no recuerdo qué me había orillado a eso, solo que estaba deshecho, como solo te permites estarlo frente a alguien seguro. No me dijo que me controlara. Dejó que lo sacara, y luego me miró y lo dijo sin rodeos.</w:t>
-      </w:r>
-    </w:p>
-    <w:p>
-      <w:pPr>
-        <w:pStyle w:val="BodyText"/>
-      </w:pPr>
-      <w:r>
-        <w:t xml:space="preserve">“</w:t>
-      </w:r>
-      <w:r>
-        <w:t xml:space="preserve">Te quiero tanto como quiero a mis propios hijos.</w:t>
-      </w:r>
-      <w:r>
-        <w:t xml:space="preserve">”</w:t>
       </w:r>
     </w:p>
     <w:p>
@@ -3130,7 +3034,7 @@
         <w:pStyle w:val="BodyText"/>
       </w:pPr>
       <w:r>
-        <w:t xml:space="preserve">Y seguía sentándome con ellos. Esa es la parte con la que me siento ahora. Todos los días lo hacían, y todos los días yo llevaba mi charola de vuelta al mismo lugar. No me cambié de mesa. No comí solo. Que ellos me molestaran se sentía mejor que no tener a nadie, y en un pueblo donde los amigos no llegaban fácil, esa era la mesa. Así que me sentaba y lo aguantaba.</w:t>
+        <w:t xml:space="preserve">Y seguía sentándome con ellos. Esa es la parte en la que me detengo ahora. Todos los días lo hacían, y todos los días yo llevaba mi charola de vuelta al mismo lugar. No me cambié de mesa. No comí solo. Que ellos me molestaran se sentía mejor que no tener a nadie, y en un pueblo donde los amigos no llegaban fácil, esa era la mesa. Así que me sentaba y lo aguantaba.</w:t>
       </w:r>
     </w:p>
     <w:p>
@@ -3307,42 +3211,24 @@
         <w:pStyle w:val="BodyText"/>
       </w:pPr>
       <w:r>
-        <w:t xml:space="preserve">“</w:t>
-      </w:r>
-      <w:r>
         <w:t xml:space="preserve">¿Quieres ir a dar una vuelta?</w:t>
       </w:r>
-      <w:r>
-        <w:t xml:space="preserve">”</w:t>
-      </w:r>
-    </w:p>
-    <w:p>
-      <w:pPr>
-        <w:pStyle w:val="BodyText"/>
-      </w:pPr>
-      <w:r>
-        <w:t xml:space="preserve">“</w:t>
-      </w:r>
+    </w:p>
+    <w:p>
+      <w:pPr>
+        <w:pStyle w:val="BodyText"/>
+      </w:pPr>
       <w:r>
         <w:t xml:space="preserve">¿A dónde vamos?</w:t>
       </w:r>
-      <w:r>
-        <w:t xml:space="preserve">”</w:t>
-      </w:r>
-    </w:p>
-    <w:p>
-      <w:pPr>
-        <w:pStyle w:val="BodyText"/>
-      </w:pPr>
-      <w:r>
-        <w:t xml:space="preserve">“</w:t>
-      </w:r>
+    </w:p>
+    <w:p>
+      <w:pPr>
+        <w:pStyle w:val="BodyText"/>
+      </w:pPr>
       <w:r>
         <w:t xml:space="preserve">Es una sorpresa.</w:t>
       </w:r>
-      <w:r>
-        <w:t xml:space="preserve">”</w:t>
-      </w:r>
     </w:p>
     <w:p>
       <w:pPr>
@@ -3365,33 +3251,15 @@
         <w:pStyle w:val="BodyText"/>
       </w:pPr>
       <w:r>
-        <w:t xml:space="preserve">“</w:t>
-      </w:r>
-      <w:r>
         <w:t xml:space="preserve">Papá. ¿A dónde vamos?</w:t>
       </w:r>
-      <w:r>
-        <w:t xml:space="preserve">”</w:t>
-      </w:r>
-    </w:p>
-    <w:p>
-      <w:pPr>
-        <w:pStyle w:val="BodyText"/>
-      </w:pPr>
-      <w:r>
-        <w:t xml:space="preserve">Volteó a verme, sonriendo un poco.</w:t>
-      </w:r>
-      <w:r>
-        <w:t xml:space="preserve"> </w:t>
-      </w:r>
-      <w:r>
-        <w:t xml:space="preserve">“</w:t>
-      </w:r>
-      <w:r>
-        <w:t xml:space="preserve">Cooperstown.</w:t>
-      </w:r>
-      <w:r>
-        <w:t xml:space="preserve">”</w:t>
+    </w:p>
+    <w:p>
+      <w:pPr>
+        <w:pStyle w:val="BodyText"/>
+      </w:pPr>
+      <w:r>
+        <w:t xml:space="preserve">Volteó a verme, sonriendo un poco. Cooperstown.</w:t>
       </w:r>
     </w:p>
     <w:p>
@@ -3415,13 +3283,7 @@
         <w:pStyle w:val="BodyText"/>
       </w:pPr>
       <w:r>
-        <w:t xml:space="preserve">“</w:t>
-      </w:r>
-      <w:r>
         <w:t xml:space="preserve">Esa es una pelota de Babe Ruth.</w:t>
-      </w:r>
-      <w:r>
-        <w:t xml:space="preserve">”</w:t>
       </w:r>
     </w:p>
     <w:p>
@@ -3467,7 +3329,7 @@
         <w:pStyle w:val="BodyText"/>
       </w:pPr>
       <w:r>
-        <w:t xml:space="preserve">Nos hicimos cercanos en primer año, cuando un maestro llamado el señor Ianuzzi daba un estudio bíblico antes de clases. Dave y yo empezamos a ir los dos porque queríamos. Él trajo a Ryan Martin, que también se volvió uno de mis mejores amigos. Los tres hablábamos como rara vez lo hacen los adolescentes, de la fe, de la distancia entre quien decías ser el domingo y quien eras el resto de la semana. Dave no necesitaba encajar. Simplemente lo vivía.</w:t>
+        <w:t xml:space="preserve">Nos hicimos cercanos en primer año, cuando un maestro, el señor Ianuzzi, daba un estudio bíblico antes de clases. Dave y yo empezamos a ir los dos porque queríamos. Él trajo a Ryan Martin, que también se volvió uno de mis mejores amigos. Los tres hablábamos como rara vez lo hacen los adolescentes, de la fe, de la distancia entre quien decías ser el domingo y quien eras el resto de la semana. Dave no necesitaba encajar. Simplemente lo vivía.</w:t>
       </w:r>
     </w:p>
     <w:p>
@@ -3504,7 +3366,7 @@
         <w:pStyle w:val="BodyText"/>
       </w:pPr>
       <w:r>
-        <w:t xml:space="preserve">Después de Ramsey, reclutaron a Dave, Syracuse, Virginia Tech, Wake Forest. Eligió Virginia Tech, donde llegó Michael Vick e hizo obsoleto el libro de jugadas. Dave lo aconsejó. Cuando estalló el escándalo de las peleas de perros años después, no se sumó al linchamiento: el tipo está rebasado, tendrá una oportunidad de redimirse. Dave llegó a la NFL, tercera opción detrás de Peyton Manning en los Colts, luego Brett Favre en los Packers, y después al entrenamiento. Luego hizo una de las cosas más valientes que le he visto hacer a un hombre: se fue a China como misionero, aprendió mandarín completo, enseñó la Biblia durante años. Esos fueron mis años de adicción activa; hablábamos, pero no seguido. En los últimos par de años nos reconectamos como si no hubiera pasado el tiempo. Dave escribió el posfacio de este libro. Eso te dice quién es.</w:t>
+        <w:t xml:space="preserve">Después de Ramsey, reclutaron a Dave, Syracuse, Virginia Tech, Wake Forest. Eligió Virginia Tech, donde llegó Michael Vick e hizo obsoleto el libro de jugadas. Dave lo aconsejó. Cuando estalló el escándalo de las peleas de perros años después, no se sumó al linchamiento: el tipo está rebasado, tendrá una oportunidad de redimirse. Dave llegó a la NFL, tercera opción detrás de Peyton Manning en los Colts, luego Brett Favre en los Packers, y después al entrenamiento. Luego hizo una de las cosas más valientes que le he visto hacer a un hombre: se fue a China como misionero, aprendió mandarín a fondo, enseñó la Biblia durante años. Esos fueron mis años de adicción activa; hablábamos, pero no seguido. En el último par de años nos reconectamos como si no hubiera pasado el tiempo. Dave escribió el posfacio de este libro. Eso te dice quién es.</w:t>
       </w:r>
     </w:p>
     <w:p>
@@ -3550,7 +3412,7 @@
           <w:iCs/>
           <w:i/>
         </w:rPr>
-        <w:t xml:space="preserve">Y todo aquel que lucha, de todo se abstiene.</w:t>
+        <w:t xml:space="preserve">Todo aquel que lucha, de todo se abstiene.</w:t>
       </w:r>
       <w:r>
         <w:rPr>
@@ -3600,7 +3462,7 @@
         <w:pStyle w:val="FirstParagraph"/>
       </w:pPr>
       <w:r>
-        <w:t xml:space="preserve">En primer año perdí las luchas que importaban. Al principio de la temporada de segundo año me tocó el primer sembrado en un torneo, un chavo que todos sabían que iba a ganar, el chavo para el que yo se suponía que sería un calentamiento. Pasó algo que todavía no puedo explicar del todo. No le tenía miedo. El miedo que había sido la nota de fondo de cada lucha desde aquella primera colgada simplemente no estaba. Lo que estaba era rabia, no contra él, sino contra la idea de que se suponía que yo debía perder. Le gané. Feo, a puro desgaste, los tres periodos completos. Pero la gané. Después Lou no dijo mucho. Una mano en el hombro. En su idioma significaba: siempre supe que esto estaba dentro de ti.</w:t>
+        <w:t xml:space="preserve">En primer año perdí las luchas que importaban. Al principio de la temporada de segundo año me tocó el primer sembrado en un torneo, un chavo que todos sabían que iba a ganar, el chavo para el que se suponía que yo sería un calentamiento. Pasó algo que todavía no puedo explicar del todo. No le tenía miedo. El miedo que había sido la nota de fondo de cada lucha desde aquella primera colgada simplemente no estaba. Lo que estaba era rabia, no contra él, sino contra la idea de que se suponía que yo debía perder. Le gané. Feo, a puro desgaste, los tres periodos completos. Pero la gané. Después Lou no dijo mucho. Una mano en el hombro. En su idioma significaba: siempre supe que esto estaba dentro de ti.</w:t>
       </w:r>
     </w:p>
     <w:p>
@@ -3646,45 +3508,15 @@
         <w:pStyle w:val="BodyText"/>
       </w:pPr>
       <w:r>
-        <w:t xml:space="preserve">Esa temporada, en Regionales, me tocó un chavo que casi nunca perdía, un nombre del condado de Bergen que todos conocían, dominante e inteligente, de los que ganan porque rara vez cometen un error. Cuartos de final, él era el segundo sembrado, yo el séptimo. Seis minutos. Faltando diez segundos, iba perdiendo 5–4. Me dejó levantarme, los tipos con experiencia hacen eso cuando van arriba, seguros de que pueden aguantar de pie. No debió hacerlo. Con tres segundos en el reloj tiré una pierna, mis brazos en su pierna antes de que mi cerebro alcanzara a entender, su equilibrio perdido. Derribo, 6–5, final. El periódico al día siguiente:</w:t>
-      </w:r>
-      <w:r>
-        <w:t xml:space="preserve"> </w:t>
-      </w:r>
-      <w:r>
-        <w:t xml:space="preserve">“</w:t>
-      </w:r>
-      <w:r>
-        <w:t xml:space="preserve">Derribo tardío mantiene con vida a Brizzi de Ramsey.</w:t>
-      </w:r>
-      <w:r>
-        <w:t xml:space="preserve">”</w:t>
-      </w:r>
-    </w:p>
-    <w:p>
-      <w:pPr>
-        <w:pStyle w:val="BodyText"/>
-      </w:pPr>
-      <w:r>
-        <w:t xml:space="preserve">Gané mi semifinal, perdí una cerrada en la final, aun así fui a Estatales. Terminé 18–4. Después de esa lucha, Lou se sentó conmigo mientras recuperaba el aliento y el cuadro seguía adelante sin nosotros. Luego:</w:t>
-      </w:r>
-      <w:r>
-        <w:t xml:space="preserve"> </w:t>
-      </w:r>
-      <w:r>
-        <w:t xml:space="preserve">“</w:t>
-      </w:r>
-      <w:r>
-        <w:t xml:space="preserve">Así eres tú.</w:t>
-      </w:r>
-      <w:r>
-        <w:t xml:space="preserve">”</w:t>
-      </w:r>
-      <w:r>
-        <w:t xml:space="preserve"> </w:t>
-      </w:r>
-      <w:r>
-        <w:t xml:space="preserve">No buena lucha. No sabía que podías lograrlo. Así eres tú. Solo asentí. Con eso le bastaba.</w:t>
+        <w:t xml:space="preserve">Esa temporada, en Regionales, me tocó un chavo que casi nunca perdía, un nombre del condado de Bergen que todos conocían, dominante e inteligente, de los que ganan porque rara vez cometen un error. Cuartos de final, él era el segundo sembrado, yo el séptimo. Seis minutos. Faltando diez segundos, iba perdiendo 5–4. Me dejó levantarme, los tipos con experiencia hacen eso cuando van arriba, seguros de que pueden aguantar de pie. No debió hacerlo. Con tres segundos en el reloj tiré una pierna, mis brazos en su pierna antes de que mi cerebro alcanzara a entender, su equilibrio perdido. Derribo, 6–5, final. El periódico al día siguiente: Derribo tardío mantiene con vida a Brizzi de Ramsey.</w:t>
+      </w:r>
+    </w:p>
+    <w:p>
+      <w:pPr>
+        <w:pStyle w:val="BodyText"/>
+      </w:pPr>
+      <w:r>
+        <w:t xml:space="preserve">Gané mi semifinal, perdí una cerrada en la final, aun así fui a Estatales. Terminé 18–4. Después de esa lucha, Lou se sentó conmigo mientras recuperaba el aliento y el cuadro seguía adelante sin nosotros. Luego: Así eres tú. No buena lucha. No sabía que podías lograrlo. Así eres tú. Solo asentí. Con eso le bastaba.</w:t>
       </w:r>
     </w:p>
     <w:bookmarkEnd w:id="37"/>
@@ -3744,25 +3576,7 @@
         <w:pStyle w:val="FirstParagraph"/>
       </w:pPr>
       <w:r>
-        <w:t xml:space="preserve">En el último año llegué a los del Condado como primer sembrado en 130. Mi hermano Chris era de primer año en 103. En el sauna, bajando de peso juntos, habíamos dicho que sería algo si algún día compartíamos un artículo. Chris dio la sorpresa contra el primer sembrado para llegar a las semifinales. El periódico lo publicó:</w:t>
-      </w:r>
-      <w:r>
-        <w:t xml:space="preserve"> </w:t>
-      </w:r>
-      <w:r>
-        <w:t xml:space="preserve">“</w:t>
-      </w:r>
-      <w:r>
-        <w:t xml:space="preserve">Los hermanos Brizzi de Ramsey son Doble Problema.</w:t>
-      </w:r>
-      <w:r>
-        <w:t xml:space="preserve">”</w:t>
-      </w:r>
-      <w:r>
-        <w:t xml:space="preserve"> </w:t>
-      </w:r>
-      <w:r>
-        <w:t xml:space="preserve">Papá estaba radiante.</w:t>
+        <w:t xml:space="preserve">En el último año llegué a los del Condado como primer sembrado en 130. Mi hermano Chris era de primer año en 103. En el sauna, bajando de peso juntos, habíamos dicho que sería algo si algún día compartíamos un artículo. Chris dio la sorpresa contra el primer sembrado para llegar a las semifinales. El periódico lo publicó: Los hermanos Brizzi de Ramsey son Doble Problema. Papá estaba radiante.</w:t>
       </w:r>
     </w:p>
     <w:p>
@@ -3808,7 +3622,7 @@
         <w:pStyle w:val="BodyText"/>
       </w:pPr>
       <w:r>
-        <w:t xml:space="preserve">Es complicado. Inteligente. Pulido y estratégico, un triunfador en el sentido verdadero. Y aun así, lo primero que cualquiera dice de él es que es bondadoso. Callada, constantemente bondadoso. Es mi mejor amigo. Tomamos caminos distintos y procesamos la misma infancia de maneras distintas, pero no hay nadie a quien prefiera que me llame la mañana de Navidad, nadie a quien prefiera tener a mi lado junto a una tumba. Lou nos formó a los dos, de maneras distintas, y nunca nos comparó. Dio la cara por los récords de Chris y por mi título del condado con el mismo orgullo.</w:t>
+        <w:t xml:space="preserve">Es complicado. Inteligente. Pulido y estratégico, un triunfador en el sentido verdadero. Y aun así, lo primero que cualquiera dice de él es que es bondadoso. Calladamente, constantemente bondadoso. Es mi mejor amigo. Tomamos caminos distintos y procesamos la misma infancia de maneras distintas, pero no hay nadie a quien prefiera que me llame la mañana de Navidad, nadie a quien prefiera tener a mi lado junto a una tumba. Lou nos formó a los dos, de maneras distintas, y nunca nos comparó. Dio la cara por los récords de Chris y por mi título del condado con el mismo orgullo.</w:t>
       </w:r>
     </w:p>
     <w:bookmarkEnd w:id="40"/>
@@ -3838,7 +3652,7 @@
         <w:pStyle w:val="BodyText"/>
       </w:pPr>
       <w:r>
-        <w:t xml:space="preserve">Lou era la excepción. A través de todo, los diecinueve segundos, las bajadas de peso, los vómitos, el tobillo lastimado, las derrotas que dolían más que las victorias, ahí estaba. No porque me estuviera volviendo una leyenda. Porque era su hijo.</w:t>
+        <w:t xml:space="preserve">Lou era la excepción. A lo largo de todo aquello, los diecinueve segundos, las bajadas de peso, los vómitos, el tobillo lastimado, las derrotas que dolían más que las victorias, ahí estaba. No porque me estuviera volviendo una leyenda. Porque era su hijo.</w:t>
       </w:r>
     </w:p>
     <w:p>
@@ -4193,61 +4007,28 @@
         <w:pStyle w:val="BodyText"/>
       </w:pPr>
       <w:r>
-        <w:t xml:space="preserve">Dejó lo que estaba haciendo y me miró.</w:t>
+        <w:t xml:space="preserve">Dejó lo que estaba haciendo y me miró. Sabes quiénes son, ¿verdad?</w:t>
+      </w:r>
+    </w:p>
+    <w:p>
+      <w:pPr>
+        <w:pStyle w:val="BodyText"/>
+      </w:pPr>
+      <w:r>
+        <w:t xml:space="preserve">Negué con la cabeza.</w:t>
+      </w:r>
+    </w:p>
+    <w:p>
+      <w:pPr>
+        <w:pStyle w:val="BodyText"/>
+      </w:pPr>
+      <w:r>
+        <w:t xml:space="preserve">Son los Rascals. Cuando eso no me dijo nada, lo intentó de nuevo. ¿Conoces</w:t>
       </w:r>
       <w:r>
         <w:t xml:space="preserve"> </w:t>
       </w:r>
       <w:r>
-        <w:t xml:space="preserve">“</w:t>
-      </w:r>
-      <w:r>
-        <w:t xml:space="preserve">¿Sabes quiénes son, verdad?</w:t>
-      </w:r>
-      <w:r>
-        <w:t xml:space="preserve">”</w:t>
-      </w:r>
-    </w:p>
-    <w:p>
-      <w:pPr>
-        <w:pStyle w:val="BodyText"/>
-      </w:pPr>
-      <w:r>
-        <w:t xml:space="preserve">Negué con la cabeza.</w:t>
-      </w:r>
-    </w:p>
-    <w:p>
-      <w:pPr>
-        <w:pStyle w:val="BodyText"/>
-      </w:pPr>
-      <w:r>
-        <w:t xml:space="preserve">“</w:t>
-      </w:r>
-      <w:r>
-        <w:t xml:space="preserve">Son los Rascals.</w:t>
-      </w:r>
-      <w:r>
-        <w:t xml:space="preserve">”</w:t>
-      </w:r>
-      <w:r>
-        <w:t xml:space="preserve"> </w:t>
-      </w:r>
-      <w:r>
-        <w:t xml:space="preserve">Cuando eso no me dijo nada, lo intentó de nuevo.</w:t>
-      </w:r>
-      <w:r>
-        <w:t xml:space="preserve"> </w:t>
-      </w:r>
-      <w:r>
-        <w:t xml:space="preserve">“</w:t>
-      </w:r>
-      <w:r>
-        <w:t xml:space="preserve">¿Conoces</w:t>
-      </w:r>
-      <w:r>
-        <w:t xml:space="preserve"> </w:t>
-      </w:r>
-      <w:r>
         <w:t xml:space="preserve">‘</w:t>
       </w:r>
       <w:r>
@@ -4270,9 +4051,6 @@
       </w:r>
       <w:r>
         <w:t xml:space="preserve">’?</w:t>
-      </w:r>
-      <w:r>
-        <w:t xml:space="preserve">”</w:t>
       </w:r>
     </w:p>
     <w:p>
@@ -4750,15 +4528,15 @@
         <w:pStyle w:val="BodyText"/>
       </w:pPr>
       <w:r>
-        <w:t xml:space="preserve">Pienso en esos cuatro años y le doy gracias a Dios por mi papá. Lou pudo haberme mandado a un colegio comunitario, una escuela local, cien opciones más baratas. En cambio me dejó ir a Miami y pidió préstamos para lograrlo. Compartía una casa rentada en Mahwah con su amigo Roger, que había pasado por un divorcio propio, y el cuarto de Lou era el chico de arriba. Chris y yo lo visitábamos y podías leerlo en su cuerpo cuando algo lo estaba pesando. Nunca nos lo echó encima. Lo cargaba, en silencio, como cargaba todo.</w:t>
-      </w:r>
-    </w:p>
-    <w:p>
-      <w:pPr>
-        <w:pStyle w:val="BodyText"/>
-      </w:pPr>
-      <w:r>
-        <w:t xml:space="preserve">Trabajó en dos empleos en esos años, y uno de ellos era en un vivero, plantando árboles, un hombre de cincuenta y tantos hincado en la tierra. Y yo fui egoísta con eso. Le llamaba por más dinero, no para libros o renta sino para tomar y salir, y él lo mandaba cada vez. No pensaba ni dos veces de dónde venía o lo que le costaba. Ahora sí.</w:t>
+        <w:t xml:space="preserve">Pienso en esos cuatro años y le doy gracias a Dios por mi papá. Lou pudo haberme mandado a un colegio comunitario, una escuela local, cien opciones más baratas. En cambio me dejó ir a Miami y pidió préstamos para lograrlo. Compartía una casa rentada en Mahwah con su amigo Roger, que había pasado por un divorcio propio, y el cuarto de Lou era el chico de arriba. Chris y yo lo visitábamos y podías leerlo en su cuerpo cuando algo le estaba pesando. Nunca nos lo echó encima. Lo cargaba, en silencio, como cargaba todo.</w:t>
+      </w:r>
+    </w:p>
+    <w:p>
+      <w:pPr>
+        <w:pStyle w:val="BodyText"/>
+      </w:pPr>
+      <w:r>
+        <w:t xml:space="preserve">Trabajó en dos empleos en esos años, y uno de ellos era en un vivero, plantando árboles, un hombre de cincuenta y tantos hincado en la tierra. Y yo fui egoísta con eso. Le llamaba por más dinero, no para libros o renta sino para tomar y salir, y él lo mandaba cada vez. No me ponía a pensar de dónde venía ni lo que le costaba. Ahora sí.</w:t>
       </w:r>
     </w:p>
     <w:p>
@@ -4872,23 +4650,9 @@
           <w:iCs/>
           <w:i/>
         </w:rPr>
-        <w:t xml:space="preserve">“</w:t>
-      </w:r>
-      <w:r>
-        <w:rPr>
-          <w:iCs/>
-          <w:i/>
-        </w:rPr>
         <w:t xml:space="preserve">¿Soy yo acaso guarda de mi hermano?</w:t>
       </w:r>
       <w:r>
-        <w:rPr>
-          <w:iCs/>
-          <w:i/>
-        </w:rPr>
-        <w:t xml:space="preserve">”</w:t>
-      </w:r>
-      <w:r>
         <w:t xml:space="preserve"> </w:t>
       </w:r>
       <w:r>
@@ -4986,7 +4750,7 @@
         <w:pStyle w:val="BodyText"/>
       </w:pPr>
       <w:r>
-        <w:t xml:space="preserve">Yo volé primero. Salí del aeropuerto al calor y al ruido y a como un millón de personas moviéndose en todas direcciones a la vez, y pensé, con toda calma, qué he hecho. Chris llegó unos días después y arrancamos, Mumbai, Delhi, Calcuta, Agra. Subimos a Dharamsala, donde vive el Dalái Lama, y resultó que estaba en la ciudad. Preguntamos si podíamos verlo. Está meditando, nos dijeron. Difícil discutir con eso.</w:t>
+        <w:t xml:space="preserve">Yo volé primero. Salí del aeropuerto al calor y al ruido y a como un millón de personas moviéndose en todas direcciones a la vez, y pensé, con toda calma, ¿qué he hecho? Chris llegó unos días después y arrancamos, Mumbai, Delhi, Calcuta, Agra. Subimos a Dharamsala, donde vive el Dalái Lama, y resultó que estaba en la ciudad. Preguntamos si podíamos verlo. Está meditando, nos dijeron. Difícil discutir con eso.</w:t>
       </w:r>
     </w:p>
     <w:p>
@@ -5048,21 +4812,7 @@
           <w:iCs/>
           <w:i/>
         </w:rPr>
-        <w:t xml:space="preserve">“</w:t>
-      </w:r>
-      <w:r>
-        <w:rPr>
-          <w:iCs/>
-          <w:i/>
-        </w:rPr>
         <w:t xml:space="preserve">El egoísmo, el egocentrismo. Creemos que esa es la raíz de nuestros problemas.</w:t>
-      </w:r>
-      <w:r>
-        <w:rPr>
-          <w:iCs/>
-          <w:i/>
-        </w:rPr>
-        <w:t xml:space="preserve">”</w:t>
       </w:r>
       <w:r>
         <w:t xml:space="preserve"> </w:t>
@@ -5391,7 +5141,7 @@
         <w:pStyle w:val="FirstParagraph"/>
       </w:pPr>
       <w:r>
-        <w:t xml:space="preserve">Cuatro años separan esos dos arrestos, y en el papel fueron los mejores cuatro años de mi vida. Los rankings, los clubes del presidente, el dinero, mi cara en la pantalla de cada tienda del país. Nadie que mirara habría dicho que había problemas. Necesitaba cinco años limpios para que el wet reckless siguiera siendo un wet reckless. Le di cuatro.</w:t>
+        <w:t xml:space="preserve">Cuatro años separan esos dos arrestos, y en el papel fueron los mejores cuatro años de mi vida. Las clasificaciones, los clubes del presidente, el dinero, mi cara en la pantalla de cada tienda del país. Nadie que mirara habría dicho que había problemas. Necesitaba cinco años limpios para que el wet reckless siguiera siendo un wet reckless. Le di cuatro.</w:t>
       </w:r>
     </w:p>
     <w:p>
@@ -5881,7 +5631,7 @@
         <w:pStyle w:val="BodyText"/>
       </w:pPr>
       <w:r>
-        <w:t xml:space="preserve">Había dejado de pagar las cosas. Las cuotas del condominio se vencieron. Los servicios se vencieron. Cortaron la luz, así que corrí un cable de extensión desde el refrigerador hasta un enchufe en el pasillo del edificio y dejé que jalara su electricidad del área común, robándola, la verdad, porque no podía, o no quería, pagar la cuenta. Había tal vez un par de yogures en ese refri. Esa era la comida en el departamento. El dinero que entraba se iba en pastillas, y cuando se acababa robaba electrónicos de las tiendas para volverlos a convertir en más.</w:t>
+        <w:t xml:space="preserve">Había dejado de pagar las cosas. Las cuotas del condominio se vencieron. Los servicios se vencieron. Cortaron la luz, así que corrí un cable de extensión desde el refrigerador hasta un enchufe en el pasillo del edificio y dejé que jalara su electricidad del área común, robándola, la verdad, porque no podía, o no quería, pagar la cuenta. Había tal vez un par de yogures en ese refri. Esa era la comida en el departamento. El dinero que entraba se iba en pastillas, y cuando se acababa robaba aparatos electrónicos de las tiendas para volverlos a convertir en más.</w:t>
       </w:r>
     </w:p>
     <w:p>
@@ -5969,7 +5719,7 @@
         <w:pStyle w:val="BodyText"/>
       </w:pPr>
       <w:r>
-        <w:t xml:space="preserve">Lou lo vio antes que yo. Le hizo un gesto con la cabeza y dijo, la abuela nos está cuidando. Se refería a su madre, Mag. Lo dijo a la ligera, de la manera en que decía cualquier cosa sobre la gente que había perdido, sin aspavientos, nada más un hecho sobre cómo funcionaba el mundo según él. No le di mucha importancia entonces. Estaba demasiado hundido para darle importancia a casi nada. Diecisiete años después uno se posaría en mi espejo, y entendería exactamente lo que mi padre me había estado diciendo en aquel estacionamiento.</w:t>
+        <w:t xml:space="preserve">Lou lo vio antes que yo. Le hizo un gesto con la cabeza y dijo, la abuela nos está cuidando. Se refería a su madre, Mag. Lo dijo a la ligera, de la manera en que decía cualquier cosa sobre la gente que había perdido, sin aspavientos, nada más un hecho sobre cómo funcionaba el mundo según él. No le di mucha importancia entonces. Estaba demasiado hundido para darle importancia a casi nada. Diecisiete años después uno se posaría en mi espejo, y yo entendería exactamente lo que mi padre me había estado diciendo en aquel estacionamiento.</w:t>
       </w:r>
     </w:p>
     <w:p>
@@ -6377,7 +6127,7 @@
         <w:pStyle w:val="BodyText"/>
       </w:pPr>
       <w:r>
-        <w:t xml:space="preserve">Ron no perdió el tiempo. Vio a través de lo que yo todavía estaba actuando. La mayoría de los hombres en esa casa eran entrenadores personales y trabajadores de cuello azul, y yo entré todavía presumiendo mi carrera, hablando de negocios con hombres que estaban ahí para seguir vivos. La brecha era ridícula, y le pusieron nombre: desde el primer día los muchachos me decían Corporate Rob. Pantalones de vestir, polo, corte de pelo, la versión de mí que había armado para convencer al mundo de que estaba bien. El apodo era en broma. También era un diagnóstico. Ron no estaba impresionado. Eso era lo que yo necesitaba.</w:t>
+        <w:t xml:space="preserve">Ron no perdió el tiempo. Vio a través de lo que yo todavía estaba actuando. La mayoría de los hombres en esa casa eran entrenadores personales y obreros, y yo entré todavía presumiendo mi carrera, hablando de negocios con hombres que estaban ahí para seguir vivos. La brecha era ridícula, y le pusieron nombre: desde el primer día los muchachos me decían Corporate Rob. Pantalones de vestir, polo, corte de pelo, la versión de mí que había armado para convencer al mundo de que estaba bien. El apodo era en broma. También era un diagnóstico. Ron no estaba impresionado. Eso era lo que yo necesitaba.</w:t>
       </w:r>
     </w:p>
     <w:p>
@@ -6669,7 +6419,7 @@
         <w:pStyle w:val="BodyText"/>
       </w:pPr>
       <w:r>
-        <w:t xml:space="preserve">Trabajé de salvavidas, vigilando el agua en la alberca de UWF. Tenía treinta y dos años en una silla donde todos los demás que trabajaban tenían diecinueve. Me sentía viejo. También me sentía bien. Tres rondas de P90X me tenían en la mejor forma en años. El trabajo era sencillo. Recorrer las caras, contar cabezas, asegurarme de que todos llegaran a casa a salvo. Dejas de poner atención y alguien podía morir. Eso me gustaba. Ser salvavidas era presencia. Montabas guardia, turno tras turno, y la mayoría de los días no pasaba nada. Ese era el punto. Un día una mamá me preguntó si le daría clases de natación a su hijo. Estoy casi seguro de que las clases no eran realmente por el niño. Dije que tal vez y volví a vigilar el agua. El yo de antes lo habría convertido en algo. El yo nuevo podía dejar que un momento se quedara pequeño.</w:t>
+        <w:t xml:space="preserve">Trabajé de salvavidas, vigilando el agua en la alberca de UWF. Tenía treinta y dos años en una silla donde todos los demás que trabajaban tenían diecinueve. Me sentía viejo. También me sentía bien. Tres rondas de P90X me tenían en la mejor forma en años. El trabajo era sencillo. Recorrer las caras, contar cabezas, asegurarme de que todos llegaran a casa a salvo. Dejabas de poner atención y alguien podía morir. Eso me gustaba. Ser salvavidas era presencia. Montabas guardia, turno tras turno, y la mayoría de los días no pasaba nada. Ese era el punto. Un día una mamá me preguntó si le daría clases de natación a su hijo. Estoy casi seguro de que las clases no eran realmente por el niño. Dije que tal vez y volví a vigilar el agua. El yo de antes lo habría convertido en algo. El yo nuevo podía dejar que un momento se quedara pequeño.</w:t>
       </w:r>
     </w:p>
     <w:p>
@@ -6693,7 +6443,7 @@
         <w:pStyle w:val="BodyText"/>
       </w:pPr>
       <w:r>
-        <w:t xml:space="preserve">Las tres cosas de Cliff se vinieron conmigo desde Chumuckla, y las hice las tres. Fui a Courage at Noon todos los días durante el primer año, una sala en propiedad de la iglesia, la misma hora, el mismo puñado de gente aprendiendo a vivir de nuevo en su hora de comida. No siempre me sentía valiente al entrar. Entraba de todos modos. Fui voluntario en esa misma iglesia dos veces por semana durante un año. Y el 5K se convirtió en un maratón, que corrí como corría casi todo ese año, a puro nervio y repetición. Lo más largo que había corrido en mi vida eran nueve millas. Al inscribirme, el maratón completo costaba diez dólares más que el medio, así que tomé el completo. Esa es toda la historia de la decisión. Caminé partes. Terminé todo. Lou me esperaba en la meta con Subway, porque claro que sí. Cientos de juntas se volvieron miles. Los martes en la noche era la mesa redonda en el sótano de una iglesia metodista, una mesa sin cabecera ni pie, el recién llegado sentado al mismo nivel que el hombre con treinta años. Las mismas sillas plegables, el mismo café malo, las mismas historias contadas por gente distinta en distintas etapas de ruina y reparación. Escuchaba más de lo que hablaba, y cuando hablaba no lo dejaba todo bien amarradito. Decía la verdad. Nadie escribe un libro sobre la junta número cuatrocientos. Pero la junta número cuatrocientos es la que te mantiene sobrio, porque te presentaste a ella igual que a la primera.</w:t>
+        <w:t xml:space="preserve">Las tres cosas de Cliff se vinieron conmigo desde Chumuckla, y las hice las tres. Fui a Courage at Noon todos los días durante el primer año, una sala propiedad de la iglesia, la misma hora, el mismo puñado de gente aprendiendo a vivir de nuevo en su hora de comida. No siempre me sentía valiente al entrar. Entraba de todos modos. Fui voluntario en esa misma iglesia dos veces por semana durante un año. Y el 5K se convirtió en un maratón, que corrí como corría casi todo ese año, a puro nervio y repetición. Lo más largo que había corrido en mi vida eran nueve millas. Al inscribirme, el maratón completo costaba diez dólares más que el medio, así que tomé el completo. Esa es toda la historia de la decisión. Caminé partes. Terminé todo. Lou me esperaba en la meta con Subway, porque claro que sí. Cientos de juntas se volvieron miles. Los martes en la noche era la mesa redonda en el sótano de una iglesia metodista, una mesa sin cabecera ni pie, el recién llegado sentado al mismo nivel que el hombre con treinta años. Las mismas sillas plegables, el mismo café malo, las mismas historias contadas por gente distinta en distintas etapas de ruina y reparación. Escuchaba más de lo que hablaba, y cuando hablaba no lo dejaba todo bien amarradito. Decía la verdad. Nadie escribe un libro sobre la junta número cuatrocientos. Pero la junta número cuatrocientos es la que te mantiene sobrio, porque te presentaste a ella igual que a la primera.</w:t>
       </w:r>
     </w:p>
     <w:p>
@@ -7235,19 +6985,7 @@
         <w:pStyle w:val="BodyText"/>
       </w:pPr>
       <w:r>
-        <w:t xml:space="preserve">“</w:t>
-      </w:r>
-      <w:r>
-        <w:t xml:space="preserve">Rob, si recaes, voy a tener que lavarme las manos de ti.</w:t>
-      </w:r>
-      <w:r>
-        <w:t xml:space="preserve">”</w:t>
-      </w:r>
-      <w:r>
-        <w:t xml:space="preserve"> </w:t>
-      </w:r>
-      <w:r>
-        <w:t xml:space="preserve">Sin emoción. Sin amenaza. Mi padre lo dijo como quien enuncia un hecho, y fue la cosa dura más amable que alguien me haya dicho jamás. Solo funcionaba viniendo de él. Se había pasado toda mi vida demostrando que nunca me dejaría de verdad. La sobriedad no borró el deseo. Eso me sorprendió. Lo que la sobriedad me dio fue tiempo. Lo que me quitó fue la anestesia, y sin ella podía sentirlo todo, el hambre incluida. La enfermedad no se fue cuando solté el trago. Se quedó callada y esperó.</w:t>
+        <w:t xml:space="preserve">Rob, si recaes, voy a tener que lavarme las manos de ti. Sin emoción. Sin amenaza. Mi padre lo dijo como quien enuncia un hecho, y fue la cosa dura más amable que alguien me haya dicho jamás. Solo funcionaba viniendo de él. Se había pasado toda mi vida demostrando que nunca me dejaría de verdad. La sobriedad no borró el deseo. Eso me sorprendió. Lo que la sobriedad me dio fue tiempo. Lo que me quitó fue la anestesia, y sin ella podía sentirlo todo, el hambre incluida. La enfermedad no se fue cuando solté el trago. Se quedó callada y esperó.</w:t>
       </w:r>
     </w:p>
     <w:p>
@@ -7968,7 +7706,7 @@
         <w:pStyle w:val="BodyText"/>
       </w:pPr>
       <w:r>
-        <w:t xml:space="preserve">Asintió despacio. No indagó más. Había oído la única cosa que quería oír. Ese padre tuyo suena como un buen hombre, dijo. El mejor hombre que he conocido, le dije. Jeff sonrió por primera vez, se puso de pie, y extendió la mano. Tienes mi bendición. Entonces sus ojos se llenaron y no apartó la mirada. Pude haberlo hecho mejor en mi matrimonio con Rhonda, dijo. Me culpo a mí mismo. No me estaba dando un discurso de padre duro. Me estaba entregando su propio arrepentimiento y confiándomelo. No lo eches a perder, agregó. No, señor. No lo haré. Después me dijo el momento en que de verdad había sabido que yo era el indicado para ella: el fin de semana, al principio, cuando Hope olvidó su identificación en un viaje a Mississippi, y me levanté antes de que amaneciera, manejé de regreso a Pensacola por ella, y nos manejé de vuelta directo.</w:t>
+        <w:t xml:space="preserve">Asintió despacio. No indagó más. Había oído la única cosa que quería oír. Ese padre tuyo suena como un buen hombre, dijo. El mejor hombre que he conocido, le dije. Jeff sonrió por primera vez, se puso de pie, y extendió la mano. Tienes mi bendición. Entonces sus ojos se llenaron y no apartó la mirada. Pude haberlo hecho mejor en mi matrimonio con Rhonda, dijo. Me culpo a mí mismo. No me estaba dando un discurso de padre duro. Me estaba entregando su propio arrepentimiento y confiándomelo. No lo eches a perder, agregó. No, señor. No lo haré. Después me dijo el momento en que de verdad había sabido que yo era el indicado para ella: el fin de semana, al principio, cuando Hope olvidó su identificación en un viaje a Mississippi, y me levanté antes de que amaneciera, manejé de regreso a Pensacola por ella, y nos llevé de vuelta directo.</w:t>
       </w:r>
     </w:p>
     <w:p>
@@ -8030,7 +7768,7 @@
         <w:pStyle w:val="BodyText"/>
       </w:pPr>
       <w:r>
-        <w:t xml:space="preserve">Se fueron juntos a la cocina mientras yo me quedé en la sala. Podía oír cajones abriéndose, platos moviéndose. No un interrogatorio. La estaba incluyendo en la vida diaria de su casa. Cuando regresaron, sirvió el café. Dos tazas, no tres. No fue un descuido.</w:t>
+        <w:t xml:space="preserve">Se fueron juntos a la cocina mientras yo me quedaba en la sala. Podía oír cajones abriéndose, platos moviéndose. No un interrogatorio. La estaba incluyendo en la vida diaria de su casa. Cuando regresaron, sirvió el café. Dos tazas, no tres. No fue un descuido.</w:t>
       </w:r>
     </w:p>
     <w:p>
@@ -8320,7 +8058,7 @@
         <w:pStyle w:val="FirstParagraph"/>
       </w:pPr>
       <w:r>
-        <w:t xml:space="preserve">En poco tiempo trabajamos como un equipo. Pagamos más de cien mil dólares en préstamos estudiantiles y construimos una vida con margen en lugar de deuda, un hogar, un poco de seguridad que nunca había tenido cuando parecía exitoso. La recuperación me enseñó sobre el dinero lo mismo que me enseñó sobre todo lo demás: cumples las promesas pequeñas, todos los días, y se van sumando hasta ser una vida. Nos mudamos a Raleigh. Nunca tuvimos hijos, y nunca lo planeamos. Lo que construimos fuimos nosotros dos, y una vida con espacio para estar presentes para los demás. En estos días eso incluye a la mamá de Hope. Rhonda vive bajo nuestro techo ahora, que no es una frase que alguien diga a la ligera, y conocerla y quererla ha sido uno de los regalos callados de esta etapa. No ha tenido la vida más fácil. Lo que no vi venir fue ver a Hope y a su mamá acercarse, despacio, a lo largo de los años, hasta que Hope empezó a llamar a Rhonda su mejor amiga. Ninguna de las cosas buenas pasa de la noche a la mañana. Hacemos viajes juntas, a los Outer Banks y a otros lados, y en algún punto de los días comunes bajo un mismo techo ha ocurrido mucha sanación, de la que no se planea, solo sigues estando presente para ella. Me toca ser testigo. Hope es mi roca. No siempre es fácil, ningún matrimonio honesto lo es, pero ella nunca ha dejado de creer en lo que estamos construyendo. Yo no me habría vuelto este hombre sin Lou. Y el amor que encontré con Hope es lo que me preparó para lo que vino después: los cuidados paliativos, sentarme en cuartos donde la gente está perdiendo a la persona que más ama. Esa es mi historia de amor. Empezó con un mensaje terco en Match.com a una muchacha que me dijo que no le escribiera. La mejor regla que he roto.</w:t>
+        <w:t xml:space="preserve">En poco tiempo trabajamos como un equipo. Pagamos más de cien mil dólares en préstamos estudiantiles y construimos una vida con margen en lugar de deuda, un hogar, un poco de seguridad que nunca había tenido cuando parecía exitoso. La recuperación me enseñó sobre el dinero lo mismo que me enseñó sobre todo lo demás: cumples las promesas pequeñas, todos los días, y se van sumando hasta ser una vida. Nos mudamos a Raleigh. Nunca tuvimos hijos, y nunca lo planeamos. Lo que construimos fuimos nosotros dos, y una vida con espacio para estar presentes para los demás. En estos días eso incluye a la mamá de Hope. Rhonda vive bajo nuestro techo ahora, que no es una frase que alguien diga a la ligera, y conocerla y quererla ha sido uno de los regalos callados de esta etapa. No ha tenido la vida más fácil. Lo que no vi venir fue ver a Hope y a su mamá acercarse, despacio, a lo largo de los años, hasta que Hope empezó a llamar a Rhonda su mejor amiga. Ninguna de las cosas buenas pasa de la noche a la mañana. Hacemos viajes juntos, a los Outer Banks y a otros lados, y en algún punto de los días comunes bajo un mismo techo ha ocurrido mucha sanación, de la que no se planea, solo sigues estando presente para ella. Me toca ser testigo. Hope es mi roca. No siempre es fácil, ningún matrimonio honesto lo es, pero ella nunca ha dejado de creer en lo que estamos construyendo. Yo no me habría vuelto este hombre sin Lou. Y el amor que encontré con Hope es lo que me preparó para lo que vino después: los cuidados paliativos, sentarme en cuartos donde la gente está perdiendo a la persona que más ama. Esa es mi historia de amor. Empezó con un mensaje terco en Match.com a una muchacha que me dijo que no le escribiera. La mejor regla que he roto.</w:t>
       </w:r>
     </w:p>
     <w:bookmarkEnd w:id="81"/>
@@ -8753,7 +8491,7 @@
         <w:pStyle w:val="BodyText"/>
       </w:pPr>
       <w:r>
-        <w:t xml:space="preserve">El reconocimiento que había dejado de perseguir tenía la manera de encontrarme de todos modos. Después de diez años en atención domiciliaria, una de las representantes de la empresa que vende Ozempic empezó a fijarse en mí en los consultorios, preguntando por ahí quién sería un buen socio. Cuando se abrió una vacante, no dejaba de llamarme. ¿Quieres postularte? No, le dije, estoy contento donde estoy. Pero un amigo me dijo, dale una oportunidad. Así que hice la entrevista y obtuve el trabajo. Fue difícil irme. Diez años. Brenda Jahn había sido una gerente increíble. Pero lo vi como una oportunidad de aprender. Cuando empecé en Novo Nordisk no sabía la diferencia entre la diabetes tipo 1 y la tipo 2. Con la capacitación y el estudio en casa me volví bueno en eso. Muy bueno.</w:t>
+        <w:t xml:space="preserve">El reconocimiento que había dejado de perseguir se las arreglaba para encontrarme de todos modos. Después de diez años en atención domiciliaria, una de las representantes de la empresa que vende Ozempic empezó a fijarse en mí en los consultorios, preguntando por ahí quién sería un buen socio. Cuando se abrió una vacante, no dejaba de llamarme. ¿Quieres postularte? No, le dije, estoy contento donde estoy. Pero un amigo me dijo, dale una oportunidad. Así que hice la entrevista y obtuve el trabajo. Fue difícil irme. Diez años. Brenda Jahn había sido una gerente increíble. Pero lo vi como una oportunidad de aprender. Cuando empecé en Novo Nordisk no sabía la diferencia entre la diabetes tipo 1 y la tipo 2. Con la capacitación y el estudio en casa me volví bueno en eso. Muy bueno.</w:t>
       </w:r>
     </w:p>
     <w:bookmarkStart w:id="88" w:name="dave-el-diabético"/>
@@ -8798,7 +8536,7 @@
         <w:pStyle w:val="BodyText"/>
       </w:pPr>
       <w:r>
-        <w:t xml:space="preserve">Como a los dos años, tuvimos una convención nacional de ventas en Las Vegas. Dave y yo teníamos una rutina cuando viajábamos, el desayuno, una pequeña oración, un mini estudio bíblico, platicar. Una mañana empezó a hablar de su hijo. Dijo, a veces me pregunto. Sé que estaba en la iglesia. Sé que tenía una relación con Cristo. Pero me preocupaba si estaba salvo. Y luego dijo, un día se posó un pájaro. El pájaro favorito de su hijo. Y él supo. Era una señal. Su muchacho estaba bien. Más tarde en ese viaje, Dave y yo fuimos al Bellagio, jugamos un par de máquinas tragamonedas y luego fuimos por helado. Yo pedí de masa de galleta, y me abrí. Le conté de los DUI, del camino que había recorrido. Él compartió algo del suyo, y eso lo guardaré entre nosotros. Oramos ahí mismo, con el helado derritiéndose en los vasos, las tragamonedas sonando a lo lejos.</w:t>
+        <w:t xml:space="preserve">Como a los dos años, tuvimos una convención nacional de ventas en Las Vegas. Dave y yo teníamos una rutina cuando viajábamos, el desayuno, una pequeña oración, un mini estudio bíblico, platicar. Una mañana empezó a hablar de su hijo. Dijo, a veces me pregunto. Sé que estaba en la iglesia. Sé que tenía una relación con Cristo. Pero me preocupaba si estaba salvo. Y luego dijo, un día se posó un pájaro. El pájaro favorito de su hijo. Y él supo. Era una señal. Su muchacho estaba bien. Más tarde en ese viaje, Dave y yo fuimos al Bellagio, jugamos en un par de máquinas tragamonedas y luego fuimos por helado. Yo pedí de masa de galleta, y me sinceré. Le conté de los DUI, del camino que había recorrido. Él compartió algo del suyo, y eso lo guardaré entre nosotros. Oramos ahí mismo, con el helado derritiéndose en los vasos, las tragamonedas sonando a lo lejos.</w:t>
       </w:r>
     </w:p>
     <w:p>
@@ -8919,7 +8657,7 @@
         <w:pStyle w:val="BodyText"/>
       </w:pPr>
       <w:r>
-        <w:t xml:space="preserve">Cinco semanas después de que empecé el trabajo en cuidados paliativos, mi padre empezó a morir. Nos mudamos a Raleigh porque la vida se estaba ampliando. Hope había sido farmacéutica durante ocho años. Raleigh tenía sentido, trabajos, comunidad, una iglesia que se sentía como nuestra. Dejar Pensacola significaba dejar raíces. Hope nunca titubeó. Así es ella. No optimista a ciegas; ve con claridad y hace preguntas difíciles. Pero debajo de todo hay una creencia firme de que Dios tiene un plan para que sirvamos. Cuando llegó la oportunidad de los cuidados paliativos, se sintió como un cuarto alrededor del cual había estado dando vueltas por años, con la puerta por fin abierta. Sin debate. Sin hoja de cálculo. Ahí era donde más me necesitaban.</w:t>
+        <w:t xml:space="preserve">Cinco semanas después de que empecé el trabajo en cuidados paliativos, mi padre empezó a morir. Nos mudamos a Raleigh porque la vida se estaba abriendo. Hope había sido farmacéutica durante ocho años. Raleigh tenía sentido, trabajos, comunidad, una iglesia que se sentía como nuestra. Dejar Pensacola significaba dejar raíces. Hope nunca titubeó. Así es ella. No optimista a ciegas; ve con claridad y hace preguntas difíciles. Pero debajo de todo hay una creencia firme de que Dios tiene un plan para que sirvamos. Cuando llegó la oportunidad de los cuidados paliativos, se sintió como un cuarto alrededor del cual había estado dando vueltas por años, con la puerta por fin abierta. Sin debate. Sin hoja de cálculo. Ahí era donde más me necesitaban.</w:t>
       </w:r>
     </w:p>
     <w:bookmarkStart w:id="91" w:name="los-cuartos"/>
@@ -8972,15 +8710,15 @@
         <w:pStyle w:val="BodyText"/>
       </w:pPr>
       <w:r>
-        <w:t xml:space="preserve">Otro cuarto se me ha quedado, y lo mantendré vago por respeto. Dos hombres, y tomó como un minuto ver que lo que había entre ellos era lo más profundo en la vida de cualquiera de los dos. Pero cuando uno de ellos hablaba del otro, la palabra que usaba era mejor amigo. Eran pareja, y habían pasado toda una vida manteniendo una distancia cuidadosa en público, y aun aquí, aun al final, el hábito se sostuvo. El amor era real. Mostrarlo todavía tenía que esconderse. No lo nombré. No me correspondía nombrarlo. Lo que más recuerdo es la sensación de que el que aún podía irse necesitaba llegar a casa, al único lugar donde los dos habían sido libres de amar en voz alta. Nunca lo he olvidado. Parte de este trabajo es notar el amor que ha tenido que vivir en clave, y hacerle espacio sin hacer un asunto de ello.</w:t>
-      </w:r>
-    </w:p>
-    <w:p>
-      <w:pPr>
-        <w:pStyle w:val="BodyText"/>
-      </w:pPr>
-      <w:r>
-        <w:t xml:space="preserve">En un cuarto estaba platicando con el paciente, un ir y venir fácil, y en algún punto le conté un poco de mi propia historia, la adicción, los años que perdí, el largo camino de regreso. He aprendido que cuando abro esa puerta aunque sea una rendija, la gente entra por ella. Su esposa había llegado a mitad de la conversación, y cuando terminé se quedó callada, luego me preguntó algo que no tenía nada que ver con su esposo y todo que ver con lo que en realidad estaba cargando. Su hijo tenía treinta y ocho años, vivía en casa, bebiéndose hasta caer. Tenía una hijita propia, y su madre pasaba las noches en vela preguntándose si él podría cuidarla. ¿La rehabilitación funciona?, quería saber. Qué podía hacer ella. Si había algo que pudiera hacer. Le di lo que tenía, la verdad tal como la había vivido, sin adornarla. Tú no lo causaste, le dije. No lo puedes controlar. No lo puedes curar. Lo que sí puedes hacer es quedarte, y ayudarlo a vivir lo suficiente para llegar ahí. Pero sobre todo entendí que había entrado a ese cuarto a acompañar a un hombre que se moría y terminé sosteniendo el otro duelo de su esposa, el de los vivos. La adicción no espera afuera de la puerta de los cuidados paliativos. Ya está en la mitad de los cuartos, y porque yo regresé de ella, las familias también me entregan ese miedo. Lo tomo.</w:t>
+        <w:t xml:space="preserve">Otro cuarto se me ha quedado, y lo mantendré vago por respeto. Dos hombres, y tomó como un minuto ver que lo que había entre ellos era lo más profundo en la vida de cualquiera de los dos. Pero cuando uno de ellos hablaba del otro, la palabra que usaba era mejor amigo. Eran pareja, y habían pasado toda una vida manteniendo una distancia cuidadosa en público, y aun aquí, aun al final, el hábito se sostuvo. El amor era real. Mostrarlo todavía tenía que esconderse. No lo nombré. No me correspondía nombrarlo. Lo que más recuerdo es la sensación de que el que aún podía irse necesitaba llegar a casa, al único lugar donde los dos habían sido libres de amar en voz alta. Nunca lo he olvidado. Parte de este trabajo es notar el amor que ha tenido que vivir en clave, y hacerle espacio sin hacer aspavientos.</w:t>
+      </w:r>
+    </w:p>
+    <w:p>
+      <w:pPr>
+        <w:pStyle w:val="BodyText"/>
+      </w:pPr>
+      <w:r>
+        <w:t xml:space="preserve">En un cuarto estaba platicando con el paciente, un ir y venir fácil, y en algún punto le conté un poco de mi propia historia, la adicción, los años que perdí, el largo camino de regreso. He aprendido que cuando abro esa puerta aunque sea una rendija, la gente entra por ella. Su esposa había llegado a mitad de la conversación, y cuando terminé se quedó callada, luego me preguntó algo que no tenía nada que ver con su esposo y todo que ver con lo que en realidad estaba cargando. Su hijo tenía treinta y ocho años, vivía en casa, bebiendo hasta caer. Tenía una hijita propia, y su madre pasaba las noches en vela preguntándose si él podría cuidarla. ¿La rehabilitación funciona?, quería saber. Qué podía hacer ella. Si había algo que pudiera hacer. Le di lo que tenía, la verdad tal como la había vivido, sin adornarla. Tú no lo causaste, le dije. No lo puedes controlar. No lo puedes curar. Lo que sí puedes hacer es quedarte, y ayudarlo a vivir lo suficiente para llegar ahí. Pero sobre todo entendí que había entrado a ese cuarto a acompañar a un hombre que se moría y terminé sosteniendo el otro duelo de su esposa, el de los vivos. La adicción no espera afuera de la puerta de los cuidados paliativos. Ya está en la mitad de los cuartos, y porque yo regresé de ella, las familias también me entregan ese miedo. Lo tomo.</w:t>
       </w:r>
     </w:p>
     <w:p>
@@ -9132,7 +8870,7 @@
         <w:pStyle w:val="BodyText"/>
       </w:pPr>
       <w:r>
-        <w:t xml:space="preserve">Lisa y yo hablamos. Sabíamos que tenía que hacer algo. Chris fue el que logró llegarle, investigó, encontró a un cirujano en Birmingham usando conexiones de un trabajo anterior, le consiguió una cita. El cirujano lo miró y dijo, etapa 4, su edad, ningún cirujano lo va a operar. Estábamos angustiados. La cirugía había funcionado la primera vez; pensamos que era la respuesta de nuevo. Salió el tema de la inmunoterapia, por lo general no tan dura con el cuerpo como la quimio o la radiación, nos dijeron. Lou accedió a intentarlo. Estaba eligiendo intentarlo. No por él. Por nosotros.</w:t>
+        <w:t xml:space="preserve">Lisa y yo hablamos. Sabíamos que tenía que hacer algo. Chris fue el que logró llegarle, investigó, encontró a un cirujano en Birmingham usando contactos de un trabajo anterior, le consiguió una cita. El cirujano lo miró y dijo, etapa 4, su edad, ningún cirujano lo va a operar. Estábamos angustiados. La cirugía había funcionado la primera vez; pensamos que era la respuesta de nuevo. Salió el tema de la inmunoterapia, por lo general no tan dura con el cuerpo como la quimio o la radiación, nos dijeron. Lou accedió a intentarlo. Estaba eligiendo intentarlo. No por él. Por nosotros.</w:t>
       </w:r>
     </w:p>
     <w:bookmarkEnd w:id="95"/>
@@ -9859,7 +9597,7 @@
         <w:pStyle w:val="BodyText"/>
       </w:pPr>
       <w:r>
-        <w:t xml:space="preserve">No discuto. Discutir con esa frase es como pierdes el cuarto, y yo no estoy ahí para ganar. Me siento donde el esposo me pueda ver y hago la única pregunta con la que siempre abro. Cuéntame de ella. No el diagnóstico. Ella.</w:t>
+        <w:t xml:space="preserve">No discuto. Discutir con esa frase es así como pierdes el cuarto, y yo no estoy ahí para ganar. Me siento donde el esposo me pueda ver y hago la única pregunta con la que siempre abro. Cuéntame de ella. No el diagnóstico. Ella.</w:t>
       </w:r>
     </w:p>
     <w:p>
@@ -10220,7 +9958,7 @@
         <w:pStyle w:val="BodyText"/>
       </w:pPr>
       <w:r>
-        <w:t xml:space="preserve">Saco mi teléfono, lento y con cuidado. Creo que estoy grabando video. Presiono el botón. El cardenal se queda. Dos minutos, quizá menos, quizá más. Al fin digo, Papá, me tengo que ir. Y vuela, sin sobresaltarse, sin ser de golpe. Se levanta del espejo hacia un árbol cercano, se queda un momento, y luego se va.</w:t>
+        <w:t xml:space="preserve">Saco mi teléfono, lento y con cuidado. Creo que estoy grabando video. Presiono el botón. El cardenal se queda. Dos minutos, quizá menos, quizá más. Al fin digo, Papá, me tengo que ir. Y vuela, sin sobresaltarse, sin brusquedad. Se levanta del espejo hacia un árbol cercano, se queda un momento, y luego se va.</w:t>
       </w:r>
     </w:p>
     <w:p>
@@ -10314,7 +10052,7 @@
         <w:pStyle w:val="BodyText"/>
       </w:pPr>
       <w:r>
-        <w:t xml:space="preserve">He estado en ambos lados de esto. Al principio no entendía la adicción como una enfermedad. La entendía como una desaparición. Un día la persona que amas sigue ahí, sentada frente a ti, usando la misma voz, con la misma cara, y de algún modo ya se está escurriendo. Sigues estirando la mano hacia la versión de ellos que recuerdas. Sigues pensando que el amor debería bastar. Luego la vida te enseña, lento y brutal, que el amor no es una cura. No va a hacer que paren. Lo que hace es evitar que tú te vayas.</w:t>
+        <w:t xml:space="preserve">He estado en ambos lados de esto. Al principio no entendía la adicción como una enfermedad. La entendía como una desaparición. Un día la persona que amas sigue ahí, sentada frente a ti, usando la misma voz, con la misma cara, y de algún modo ya se está escurriendo. Sigues estirando la mano hacia la versión de esa persona que recuerdas. Sigues pensando que el amor debería bastar. Luego la vida te enseña, lento y brutal, que el amor no es una cura. No va a hacer que paren. Lo que hace es evitar que tú te vayas.</w:t>
       </w:r>
     </w:p>
     <w:p>
@@ -10802,7 +10540,7 @@
         <w:pStyle w:val="BodyText"/>
       </w:pPr>
       <w:r>
-        <w:t xml:space="preserve">Esta es una historia real, contada de memoria. Los diálogos han sido reconstruidos con toda la fidelidad que la memoria permite; conservan la esencia de lo que se dijo, aunque no siempre las palabras exactas. Algunos nombres y detalles que identifican a las personas han sido cambiados para proteger la privacidad, sobre todo los de los pacientes y las familias a quienes atendí en la atención domiciliaria y en los cuidados paliativos, cuyos días más difíciles merecen protección, no exposición. Donde los hombres y las mujeres sobrios de las salas aparecen con sus nombres reales, es con su permiso; a otros les cambié el nombre. Algunas de las salas que describo de mi trabajo son composiciones de muchas salas, por la misma razón. Nada en estas páginas fue inventado para darle más filo a la historia. Mi madre, que está por todo este libro, revisó más de estos recuerdos que nadie. Todo lo que aún así me quedó mal es mío.</w:t>
+        <w:t xml:space="preserve">Esta es una historia real, contada de memoria. Los diálogos han sido reconstruidos con toda la fidelidad que la memoria permite; conservan la esencia de lo que se dijo, aunque no siempre las palabras exactas. Algunos nombres y detalles que identifican a las personas han sido cambiados para proteger la privacidad, sobre todo los de los pacientes y las familias a quienes atendí en la atención domiciliaria y en los cuidados paliativos, cuyos días más difíciles merecen protección, no exposición. Donde los hombres y las mujeres sobrios de las salas aparecen con sus nombres reales, es con su permiso; a otros les cambié el nombre. Algunas de las salas que describo de mi trabajo son composiciones de muchas salas, por la misma razón. Nada en estas páginas fue inventado para darle más filo a la historia. Mi madre, que está por todo este libro, revisó más de estos recuerdos que nadie. Todo lo que aun así me quedó mal es mío.</w:t>
       </w:r>
     </w:p>
     <w:bookmarkEnd w:id="115"/>

</xml_diff>